<commit_message>
Añadir: Se agregó el documento donde se registran todas mis atividades hasta el momento como prestador de servicio social
</commit_message>
<xml_diff>
--- a/DOCUMENTOS-SENSORES/BITACORA-ServicioSocial.docx
+++ b/DOCUMENTOS-SENSORES/BITACORA-ServicioSocial.docx
@@ -576,25 +576,43 @@
         <w:rPr>
           <w:lang w:val="es-ES"/>
         </w:rPr>
-        <w:t>-agosto-</w:t>
+        <w:t>-</w:t>
       </w:r>
       <w:r>
         <w:rPr>
           <w:lang w:val="es-ES"/>
         </w:rPr>
-        <w:t>2025 al 14</w:t>
+        <w:t>agosto-</w:t>
       </w:r>
       <w:r>
         <w:rPr>
           <w:lang w:val="es-ES"/>
         </w:rPr>
+        <w:t>2025 al 1</w:t>
+      </w:r>
+      <w:r>
+        <w:rPr>
+          <w:lang w:val="es-ES"/>
+        </w:rPr>
+        <w:t>2</w:t>
+      </w:r>
+      <w:r>
+        <w:rPr>
+          <w:lang w:val="es-ES"/>
+        </w:rPr>
         <w:t>-m</w:t>
       </w:r>
       <w:r>
         <w:rPr>
           <w:lang w:val="es-ES"/>
         </w:rPr>
-        <w:t>arzo</w:t>
+        <w:t>a</w:t>
+      </w:r>
+      <w:r>
+        <w:rPr>
+          <w:lang w:val="es-ES"/>
+        </w:rPr>
+        <w:t>yo</w:t>
       </w:r>
       <w:r>
         <w:rPr>
@@ -1914,7 +1932,19 @@
               <w:rPr>
                 <w:lang w:val="es-ES"/>
               </w:rPr>
-              <w:t xml:space="preserve">Pruebas con el sensor DHT11 utilizando los microcontroladores NodeMCU V.3 y el ESP32-C3 Super Mini, desarrollo de documentación tales como: </w:t>
+              <w:t>Pruebas con el sensor DHT11 utilizando los microcontroladores NodeMCU V.3 y el ESP32-C3 Super</w:t>
+            </w:r>
+            <w:r>
+              <w:rPr>
+                <w:lang w:val="es-ES"/>
+              </w:rPr>
+              <w:t>m</w:t>
+            </w:r>
+            <w:r>
+              <w:rPr>
+                <w:lang w:val="es-ES"/>
+              </w:rPr>
+              <w:t xml:space="preserve">ini, desarrollo de documentación tales como: </w:t>
             </w:r>
             <w:r>
               <w:rPr>
@@ -2146,6 +2176,42 @@
                 <w:lang w:val="es-ES"/>
               </w:rPr>
             </w:pPr>
+            <w:r>
+              <w:rPr>
+                <w:lang w:val="es-ES"/>
+              </w:rPr>
+              <w:t>Se eligió la fuente de alimentación primaria de los microcontroladores NodeMCU V3 y ESP32-C3 (conexión directa al tomacorriente), se rediseñó el formato de las métricas para su exposición a Prometheus para tener una optimizada manera de recopilar los datos de cada sensor, se programó y se construyó 6 nodos para la red de sensores (</w:t>
+            </w:r>
+            <w:r>
+              <w:rPr>
+                <w:lang w:val="es-ES"/>
+              </w:rPr>
+              <w:t>2</w:t>
+            </w:r>
+            <w:r>
+              <w:rPr>
+                <w:lang w:val="es-ES"/>
+              </w:rPr>
+              <w:t xml:space="preserve"> con el microcontrolador NodeMCU V3 y </w:t>
+            </w:r>
+            <w:r>
+              <w:rPr>
+                <w:lang w:val="es-ES"/>
+              </w:rPr>
+              <w:t>4</w:t>
+            </w:r>
+            <w:r>
+              <w:rPr>
+                <w:lang w:val="es-ES"/>
+              </w:rPr>
+              <w:t xml:space="preserve"> con el ESP32-C3 Supermini) y se distribuyeron a lo largo del área de Supercómputo de la DGTIC, se tomó medidas físicas del área de Supercomputo para la elaboración del plano de distribución de cada sensor y se empezó con la </w:t>
+            </w:r>
+            <w:r>
+              <w:rPr>
+                <w:lang w:val="es-ES"/>
+              </w:rPr>
+              <w:t>investigación y diseño de un sistema de adquisición de datos.</w:t>
+            </w:r>
           </w:p>
         </w:tc>
       </w:tr>
@@ -2221,6 +2287,48 @@
                 <w:lang w:val="es-ES"/>
               </w:rPr>
             </w:pPr>
+            <w:r>
+              <w:rPr>
+                <w:lang w:val="es-ES"/>
+              </w:rPr>
+              <w:t xml:space="preserve">Se desarrolló en base a la investigación y diseño de un sistema de adquisición de datos </w:t>
+            </w:r>
+            <w:r>
+              <w:rPr>
+                <w:lang w:val="es-ES"/>
+              </w:rPr>
+              <w:t>un Chatbot de Telegram</w:t>
+            </w:r>
+            <w:r>
+              <w:rPr>
+                <w:lang w:val="es-ES"/>
+              </w:rPr>
+              <w:t xml:space="preserve"> en python</w:t>
+            </w:r>
+            <w:r>
+              <w:rPr>
+                <w:lang w:val="es-ES"/>
+              </w:rPr>
+              <w:t xml:space="preserve"> para </w:t>
+            </w:r>
+            <w:r>
+              <w:rPr>
+                <w:lang w:val="es-ES"/>
+              </w:rPr>
+              <w:t>la</w:t>
+            </w:r>
+            <w:r>
+              <w:rPr>
+                <w:lang w:val="es-ES"/>
+              </w:rPr>
+              <w:t xml:space="preserve"> red de sensores DHT22</w:t>
+            </w:r>
+            <w:r>
+              <w:rPr>
+                <w:lang w:val="es-ES"/>
+              </w:rPr>
+              <w:t xml:space="preserve"> a partir de la conexión que existe entre los microcontroladores y Prometheus, el propósito de este sistema es generar reportes del estado actual de los sensores, imágenes detallas con el flujo de los datos de temperatura y humedad relativa a través del tiempo, reportes PDF completos con todos los registros y archivos CSV con los datos en un formato especifico de uno o todos los sensores DHT22 de la red, además se fue mejorando a lo largo de la etapa del desarrollo del bot y agregando nuevas funcionalidades, correcciones o mejoras, así como también el desarrollo de su documentación completa.</w:t>
+            </w:r>
           </w:p>
         </w:tc>
       </w:tr>
@@ -2296,6 +2404,30 @@
                 <w:lang w:val="es-ES"/>
               </w:rPr>
             </w:pPr>
+            <w:r>
+              <w:rPr>
+                <w:lang w:val="es-ES"/>
+              </w:rPr>
+              <w:t>Se hicieron mejoras al sistema en general (tanto en el apartado del hardware como en software)</w:t>
+            </w:r>
+            <w:r>
+              <w:rPr>
+                <w:lang w:val="es-ES"/>
+              </w:rPr>
+              <w:t xml:space="preserve"> de la red de sensores</w:t>
+            </w:r>
+            <w:r>
+              <w:rPr>
+                <w:lang w:val="es-ES"/>
+              </w:rPr>
+              <w:t>, además se desarrolló el borrador de un artículo titulado “Diseño e Implementación de una Red IoT para Monitoreo Ambiental con Visualización y Alertas en Tiempo Real”</w:t>
+            </w:r>
+            <w:r>
+              <w:rPr>
+                <w:lang w:val="es-ES"/>
+              </w:rPr>
+              <w:t xml:space="preserve"> para la Revista de Tecnología e Innovación en Educación Superior (TIES) de la DGTIC para su posible publicación futura.</w:t>
+            </w:r>
           </w:p>
         </w:tc>
       </w:tr>
@@ -2336,7 +2468,19 @@
               <w:rPr>
                 <w:lang w:val="es-ES"/>
               </w:rPr>
-              <w:t>19/05/2026</w:t>
+              <w:t>1</w:t>
+            </w:r>
+            <w:r>
+              <w:rPr>
+                <w:lang w:val="es-ES"/>
+              </w:rPr>
+              <w:t>2</w:t>
+            </w:r>
+            <w:r>
+              <w:rPr>
+                <w:lang w:val="es-ES"/>
+              </w:rPr>
+              <w:t>/05/2026</w:t>
             </w:r>
           </w:p>
         </w:tc>
@@ -2356,7 +2500,7 @@
               <w:rPr>
                 <w:lang w:val="es-ES"/>
               </w:rPr>
-              <w:t>60</w:t>
+              <w:t>40</w:t>
             </w:r>
           </w:p>
         </w:tc>

</xml_diff>